<commit_message>
Incorpora las aclaraciones sobre la ME y la muestra 3
- «ME» se define como microemulsión en todo el documento.
- Las muestras 1 y 5 usan preparaciones distintas de microemulsión (37 µg/µl
  y 10 µg/µl). Se añade una tabla comparativa en el apartado 2 y se advierte
  que sus dosis solo son comparables en masa o por el ratio ME:DNA.
- La muestra 3 no figura porque no llegó a utilizarse.

Estos tres puntos salen de la lista de pendientes. Se añade en su lugar la
preparación de ME empleada en las muestras 2 y 4, que sigue sin constar.

Co-Authored-By: Claude Opus 5 <noreply@anthropic.com>
Claude-Session: https://claude.ai/code/session_01NbLCpPtyUPtNBiPfSZ2z13
</commit_message>
<xml_diff>
--- a/protocolos/Tratamiento_muestras_ME-DNA_03-08-2026.docx
+++ b/protocolos/Tratamiento_muestras_ME-DNA_03-08-2026.docx
@@ -31,7 +31,7 @@
           <w:sz w:val="40"/>
           <w:szCs w:val="40"/>
         </w:rPr>
-        <w:t xml:space="preserve">Tratamiento de las muestras: complejos ME/DNA</w:t>
+        <w:t xml:space="preserve">Tratamiento de las muestras: complejos microemulsión/DNA</w:t>
       </w:r>
     </w:p>
     <w:p>
@@ -338,6 +338,58 @@
                 <w:szCs w:val="19"/>
               </w:rPr>
               <w:t xml:space="preserve">Muestras 1, 2, 4 y 5 + control positivo</w:t>
+            </w:r>
+          </w:p>
+        </w:tc>
+      </w:tr>
+      <w:tr>
+        <w:tc>
+          <w:tcPr>
+            <w:tcW w:type="dxa" w:w="2400"/>
+            <w:tcMar>
+              <w:top w:type="dxa" w:w="60"/>
+              <w:left w:type="dxa" w:w="90"/>
+              <w:bottom w:type="dxa" w:w="60"/>
+              <w:right w:type="dxa" w:w="90"/>
+            </w:tcMar>
+          </w:tcPr>
+          <w:p>
+            <w:pPr>
+              <w:spacing w:after="0" w:line="240"/>
+              <w:jc w:val="left"/>
+            </w:pPr>
+            <w:r>
+              <w:rPr>
+                <w:rFonts w:ascii="Calibri" w:cs="Calibri" w:eastAsia="Calibri" w:hAnsi="Calibri"/>
+                <w:sz w:val="19"/>
+                <w:szCs w:val="19"/>
+              </w:rPr>
+              <w:t xml:space="preserve">Vehículo ensayado</w:t>
+            </w:r>
+          </w:p>
+        </w:tc>
+        <w:tc>
+          <w:tcPr>
+            <w:tcW w:type="dxa" w:w="6620"/>
+            <w:tcMar>
+              <w:top w:type="dxa" w:w="60"/>
+              <w:left w:type="dxa" w:w="90"/>
+              <w:bottom w:type="dxa" w:w="60"/>
+              <w:right w:type="dxa" w:w="90"/>
+            </w:tcMar>
+          </w:tcPr>
+          <w:p>
+            <w:pPr>
+              <w:spacing w:after="0" w:line="240"/>
+              <w:jc w:val="left"/>
+            </w:pPr>
+            <w:r>
+              <w:rPr>
+                <w:rFonts w:ascii="Calibri" w:cs="Calibri" w:eastAsia="Calibri" w:hAnsi="Calibri"/>
+                <w:sz w:val="19"/>
+                <w:szCs w:val="19"/>
+              </w:rPr>
+              <w:t xml:space="preserve">Microemulsión (ME), en dos preparaciones de distinta concentración</w:t>
             </w:r>
           </w:p>
         </w:tc>
@@ -713,7 +765,7 @@
                 <w:sz w:val="19"/>
                 <w:szCs w:val="19"/>
               </w:rPr>
-              <w:t xml:space="preserve">Denominación empleada en las notas para el vehículo ensayado</w:t>
+              <w:t xml:space="preserve">Microemulsión</w:t>
             </w:r>
           </w:p>
         </w:tc>
@@ -738,7 +790,7 @@
                 <w:sz w:val="19"/>
                 <w:szCs w:val="19"/>
               </w:rPr>
-              <w:t xml:space="preserve">Las notas no desarrollan la sigla; se menciona su «naturaleza oleosa» (muestra 2). Conviene definirla al enviar el documento.</w:t>
+              <w:t xml:space="preserve">Vehículo ensayado. Se emplean dos preparaciones distintas, de distinta concentración (ver más abajo). Su naturaleza oleosa condiciona el ensayo de la muestra 2.</w:t>
             </w:r>
           </w:p>
         </w:tc>
@@ -1102,6 +1154,393 @@
           <w:szCs w:val="21"/>
         </w:rPr>
         <w:t xml:space="preserve">, no por lo que se pipetea en el eppendorf. Así, la condición «0,25 µl + 0,3 µg DNA» significa que cada pocillo recibe 0,25 µl de ME y 0,3 µg de DNA, aunque en el eppendorf se pipeteen 1 µl de ME y 2 µl de DNA (cantidad para las 4 réplicas).</w:t>
+      </w:r>
+    </w:p>
+    <w:p>
+      <w:pPr>
+        <w:spacing w:after="120" w:before="120" w:line="276"/>
+      </w:pPr>
+      <w:r>
+        <w:rPr>
+          <w:rFonts w:ascii="Calibri" w:cs="Calibri" w:eastAsia="Calibri" w:hAnsi="Calibri"/>
+          <w:b/>
+          <w:bCs/>
+          <w:sz w:val="21"/>
+          <w:szCs w:val="21"/>
+        </w:rPr>
+        <w:t xml:space="preserve">Dos preparaciones distintas de microemulsión. </w:t>
+      </w:r>
+      <w:r>
+        <w:rPr>
+          <w:rFonts w:ascii="Calibri" w:cs="Calibri" w:eastAsia="Calibri" w:hAnsi="Calibri"/>
+          <w:sz w:val="21"/>
+          <w:szCs w:val="21"/>
+        </w:rPr>
+        <w:t xml:space="preserve">Las muestras 1 y 5 no emplean la misma preparación de ME, y por eso cada una nombra sus condiciones de una forma: la muestra 1 por volumen y la muestra 5 por masa. Las concentraciones que se deducen de las cantidades anotadas son:</w:t>
+      </w:r>
+    </w:p>
+    <w:tbl>
+      <w:tblPr>
+        <w:tblW w:type="dxa" w:w="9020"/>
+        <w:tblBorders>
+          <w:top w:val="single" w:color="1F4E79" w:sz="4"/>
+          <w:left w:val="single" w:color="BFBFBF" w:sz="2"/>
+          <w:bottom w:val="single" w:color="1F4E79" w:sz="4"/>
+          <w:right w:val="single" w:color="BFBFBF" w:sz="2"/>
+          <w:insideH w:val="single" w:color="BFBFBF" w:sz="2"/>
+          <w:insideV w:val="single" w:color="BFBFBF" w:sz="2"/>
+        </w:tblBorders>
+      </w:tblPr>
+      <w:tblGrid>
+        <w:gridCol w:w="1800"/>
+        <w:gridCol w:w="3500"/>
+        <w:gridCol w:w="3720"/>
+      </w:tblGrid>
+      <w:tr>
+        <w:trPr>
+          <w:tblHeader/>
+        </w:trPr>
+        <w:tc>
+          <w:tcPr>
+            <w:tcW w:type="dxa" w:w="1800"/>
+            <w:shd w:fill="1F4E79" w:color="auto" w:val="clear"/>
+            <w:tcMar>
+              <w:top w:type="dxa" w:w="60"/>
+              <w:left w:type="dxa" w:w="90"/>
+              <w:bottom w:type="dxa" w:w="60"/>
+              <w:right w:type="dxa" w:w="90"/>
+            </w:tcMar>
+          </w:tcPr>
+          <w:p>
+            <w:pPr>
+              <w:spacing w:after="0" w:line="240"/>
+              <w:jc w:val="center"/>
+            </w:pPr>
+            <w:r>
+              <w:rPr>
+                <w:rFonts w:ascii="Calibri" w:cs="Calibri" w:eastAsia="Calibri" w:hAnsi="Calibri"/>
+                <w:b/>
+                <w:bCs/>
+                <w:color w:val="FFFFFF"/>
+                <w:sz w:val="19"/>
+                <w:szCs w:val="19"/>
+              </w:rPr>
+              <w:t xml:space="preserve">Muestra</w:t>
+            </w:r>
+          </w:p>
+        </w:tc>
+        <w:tc>
+          <w:tcPr>
+            <w:tcW w:type="dxa" w:w="3500"/>
+            <w:shd w:fill="1F4E79" w:color="auto" w:val="clear"/>
+            <w:tcMar>
+              <w:top w:type="dxa" w:w="60"/>
+              <w:left w:type="dxa" w:w="90"/>
+              <w:bottom w:type="dxa" w:w="60"/>
+              <w:right w:type="dxa" w:w="90"/>
+            </w:tcMar>
+          </w:tcPr>
+          <w:p>
+            <w:pPr>
+              <w:spacing w:after="0" w:line="240"/>
+              <w:jc w:val="center"/>
+            </w:pPr>
+            <w:r>
+              <w:rPr>
+                <w:rFonts w:ascii="Calibri" w:cs="Calibri" w:eastAsia="Calibri" w:hAnsi="Calibri"/>
+                <w:b/>
+                <w:bCs/>
+                <w:color w:val="FFFFFF"/>
+                <w:sz w:val="19"/>
+                <w:szCs w:val="19"/>
+              </w:rPr>
+              <w:t xml:space="preserve">Concentración de la ME (calculada)</w:t>
+            </w:r>
+          </w:p>
+        </w:tc>
+        <w:tc>
+          <w:tcPr>
+            <w:tcW w:type="dxa" w:w="3720"/>
+            <w:shd w:fill="1F4E79" w:color="auto" w:val="clear"/>
+            <w:tcMar>
+              <w:top w:type="dxa" w:w="60"/>
+              <w:left w:type="dxa" w:w="90"/>
+              <w:bottom w:type="dxa" w:w="60"/>
+              <w:right w:type="dxa" w:w="90"/>
+            </w:tcMar>
+          </w:tcPr>
+          <w:p>
+            <w:pPr>
+              <w:spacing w:after="0" w:line="240"/>
+              <w:jc w:val="center"/>
+            </w:pPr>
+            <w:r>
+              <w:rPr>
+                <w:rFonts w:ascii="Calibri" w:cs="Calibri" w:eastAsia="Calibri" w:hAnsi="Calibri"/>
+                <w:b/>
+                <w:bCs/>
+                <w:color w:val="FFFFFF"/>
+                <w:sz w:val="19"/>
+                <w:szCs w:val="19"/>
+              </w:rPr>
+              <w:t xml:space="preserve">Equivalencia que consta en las notas</w:t>
+            </w:r>
+          </w:p>
+        </w:tc>
+      </w:tr>
+      <w:tr>
+        <w:tc>
+          <w:tcPr>
+            <w:tcW w:type="dxa" w:w="1800"/>
+            <w:tcMar>
+              <w:top w:type="dxa" w:w="60"/>
+              <w:left w:type="dxa" w:w="90"/>
+              <w:bottom w:type="dxa" w:w="60"/>
+              <w:right w:type="dxa" w:w="90"/>
+            </w:tcMar>
+          </w:tcPr>
+          <w:p>
+            <w:pPr>
+              <w:spacing w:after="0" w:line="240"/>
+              <w:jc w:val="left"/>
+            </w:pPr>
+            <w:r>
+              <w:rPr>
+                <w:rFonts w:ascii="Calibri" w:cs="Calibri" w:eastAsia="Calibri" w:hAnsi="Calibri"/>
+                <w:sz w:val="19"/>
+                <w:szCs w:val="19"/>
+              </w:rPr>
+              <w:t xml:space="preserve">Muestra 1</w:t>
+            </w:r>
+          </w:p>
+        </w:tc>
+        <w:tc>
+          <w:tcPr>
+            <w:tcW w:type="dxa" w:w="3500"/>
+            <w:tcMar>
+              <w:top w:type="dxa" w:w="60"/>
+              <w:left w:type="dxa" w:w="90"/>
+              <w:bottom w:type="dxa" w:w="60"/>
+              <w:right w:type="dxa" w:w="90"/>
+            </w:tcMar>
+          </w:tcPr>
+          <w:p>
+            <w:pPr>
+              <w:spacing w:after="0" w:line="240"/>
+              <w:jc w:val="center"/>
+            </w:pPr>
+            <w:r>
+              <w:rPr>
+                <w:rFonts w:ascii="Calibri" w:cs="Calibri" w:eastAsia="Calibri" w:hAnsi="Calibri"/>
+                <w:sz w:val="19"/>
+                <w:szCs w:val="19"/>
+              </w:rPr>
+              <w:t xml:space="preserve">37 µg/µl</w:t>
+            </w:r>
+          </w:p>
+        </w:tc>
+        <w:tc>
+          <w:tcPr>
+            <w:tcW w:type="dxa" w:w="3720"/>
+            <w:tcMar>
+              <w:top w:type="dxa" w:w="60"/>
+              <w:left w:type="dxa" w:w="90"/>
+              <w:bottom w:type="dxa" w:w="60"/>
+              <w:right w:type="dxa" w:w="90"/>
+            </w:tcMar>
+          </w:tcPr>
+          <w:p>
+            <w:pPr>
+              <w:spacing w:after="0" w:line="240"/>
+              <w:jc w:val="center"/>
+            </w:pPr>
+            <w:r>
+              <w:rPr>
+                <w:rFonts w:ascii="Calibri" w:cs="Calibri" w:eastAsia="Calibri" w:hAnsi="Calibri"/>
+                <w:sz w:val="19"/>
+                <w:szCs w:val="19"/>
+              </w:rPr>
+              <w:t xml:space="preserve">0,25 µl ≡ 9,25 µg</w:t>
+            </w:r>
+          </w:p>
+        </w:tc>
+      </w:tr>
+      <w:tr>
+        <w:tc>
+          <w:tcPr>
+            <w:tcW w:type="dxa" w:w="1800"/>
+            <w:shd w:fill="F2F2F2" w:color="auto" w:val="clear"/>
+            <w:tcMar>
+              <w:top w:type="dxa" w:w="60"/>
+              <w:left w:type="dxa" w:w="90"/>
+              <w:bottom w:type="dxa" w:w="60"/>
+              <w:right w:type="dxa" w:w="90"/>
+            </w:tcMar>
+          </w:tcPr>
+          <w:p>
+            <w:pPr>
+              <w:spacing w:after="0" w:line="240"/>
+              <w:jc w:val="left"/>
+            </w:pPr>
+            <w:r>
+              <w:rPr>
+                <w:rFonts w:ascii="Calibri" w:cs="Calibri" w:eastAsia="Calibri" w:hAnsi="Calibri"/>
+                <w:sz w:val="19"/>
+                <w:szCs w:val="19"/>
+              </w:rPr>
+              <w:t xml:space="preserve">Muestra 5</w:t>
+            </w:r>
+          </w:p>
+        </w:tc>
+        <w:tc>
+          <w:tcPr>
+            <w:tcW w:type="dxa" w:w="3500"/>
+            <w:shd w:fill="F2F2F2" w:color="auto" w:val="clear"/>
+            <w:tcMar>
+              <w:top w:type="dxa" w:w="60"/>
+              <w:left w:type="dxa" w:w="90"/>
+              <w:bottom w:type="dxa" w:w="60"/>
+              <w:right w:type="dxa" w:w="90"/>
+            </w:tcMar>
+          </w:tcPr>
+          <w:p>
+            <w:pPr>
+              <w:spacing w:after="0" w:line="240"/>
+              <w:jc w:val="center"/>
+            </w:pPr>
+            <w:r>
+              <w:rPr>
+                <w:rFonts w:ascii="Calibri" w:cs="Calibri" w:eastAsia="Calibri" w:hAnsi="Calibri"/>
+                <w:sz w:val="19"/>
+                <w:szCs w:val="19"/>
+              </w:rPr>
+              <w:t xml:space="preserve">10 µg/µl</w:t>
+            </w:r>
+          </w:p>
+        </w:tc>
+        <w:tc>
+          <w:tcPr>
+            <w:tcW w:type="dxa" w:w="3720"/>
+            <w:shd w:fill="F2F2F2" w:color="auto" w:val="clear"/>
+            <w:tcMar>
+              <w:top w:type="dxa" w:w="60"/>
+              <w:left w:type="dxa" w:w="90"/>
+              <w:bottom w:type="dxa" w:w="60"/>
+              <w:right w:type="dxa" w:w="90"/>
+            </w:tcMar>
+          </w:tcPr>
+          <w:p>
+            <w:pPr>
+              <w:spacing w:after="0" w:line="240"/>
+              <w:jc w:val="center"/>
+            </w:pPr>
+            <w:r>
+              <w:rPr>
+                <w:rFonts w:ascii="Calibri" w:cs="Calibri" w:eastAsia="Calibri" w:hAnsi="Calibri"/>
+                <w:sz w:val="19"/>
+                <w:szCs w:val="19"/>
+              </w:rPr>
+              <w:t xml:space="preserve">1 µl ≡ 10 µg</w:t>
+            </w:r>
+          </w:p>
+        </w:tc>
+      </w:tr>
+      <w:tr>
+        <w:tc>
+          <w:tcPr>
+            <w:tcW w:type="dxa" w:w="1800"/>
+            <w:tcMar>
+              <w:top w:type="dxa" w:w="60"/>
+              <w:left w:type="dxa" w:w="90"/>
+              <w:bottom w:type="dxa" w:w="60"/>
+              <w:right w:type="dxa" w:w="90"/>
+            </w:tcMar>
+          </w:tcPr>
+          <w:p>
+            <w:pPr>
+              <w:spacing w:after="0" w:line="240"/>
+              <w:jc w:val="left"/>
+            </w:pPr>
+            <w:r>
+              <w:rPr>
+                <w:rFonts w:ascii="Calibri" w:cs="Calibri" w:eastAsia="Calibri" w:hAnsi="Calibri"/>
+                <w:sz w:val="19"/>
+                <w:szCs w:val="19"/>
+              </w:rPr>
+              <w:t xml:space="preserve">Muestras 2 y 4</w:t>
+            </w:r>
+          </w:p>
+        </w:tc>
+        <w:tc>
+          <w:tcPr>
+            <w:tcW w:type="dxa" w:w="3500"/>
+            <w:tcMar>
+              <w:top w:type="dxa" w:w="60"/>
+              <w:left w:type="dxa" w:w="90"/>
+              <w:bottom w:type="dxa" w:w="60"/>
+              <w:right w:type="dxa" w:w="90"/>
+            </w:tcMar>
+          </w:tcPr>
+          <w:p>
+            <w:pPr>
+              <w:spacing w:after="0" w:line="240"/>
+              <w:jc w:val="center"/>
+            </w:pPr>
+            <w:r>
+              <w:rPr>
+                <w:rFonts w:ascii="Calibri" w:cs="Calibri" w:eastAsia="Calibri" w:hAnsi="Calibri"/>
+                <w:sz w:val="19"/>
+                <w:szCs w:val="19"/>
+              </w:rPr>
+              <w:t xml:space="preserve">No consta</w:t>
+            </w:r>
+          </w:p>
+        </w:tc>
+        <w:tc>
+          <w:tcPr>
+            <w:tcW w:type="dxa" w:w="3720"/>
+            <w:tcMar>
+              <w:top w:type="dxa" w:w="60"/>
+              <w:left w:type="dxa" w:w="90"/>
+              <w:bottom w:type="dxa" w:w="60"/>
+              <w:right w:type="dxa" w:w="90"/>
+            </w:tcMar>
+          </w:tcPr>
+          <w:p>
+            <w:pPr>
+              <w:spacing w:after="0" w:line="240"/>
+              <w:jc w:val="center"/>
+            </w:pPr>
+            <w:r>
+              <w:rPr>
+                <w:rFonts w:ascii="Calibri" w:cs="Calibri" w:eastAsia="Calibri" w:hAnsi="Calibri"/>
+                <w:sz w:val="19"/>
+                <w:szCs w:val="19"/>
+              </w:rPr>
+              <w:t xml:space="preserve">—</w:t>
+            </w:r>
+          </w:p>
+        </w:tc>
+      </w:tr>
+    </w:tbl>
+    <w:p>
+      <w:pPr>
+        <w:spacing w:after="100"/>
+      </w:pPr>
+    </w:p>
+    <w:p>
+      <w:pPr>
+        <w:spacing w:after="120" w:before="0" w:line="276"/>
+      </w:pPr>
+      <w:r>
+        <w:rPr>
+          <w:rFonts w:ascii="Calibri" w:cs="Calibri" w:eastAsia="Calibri" w:hAnsi="Calibri"/>
+          <w:i/>
+          <w:iCs/>
+          <w:sz w:val="19"/>
+          <w:szCs w:val="19"/>
+        </w:rPr>
+        <w:t xml:space="preserve">Por tanto, las dosis de ME de la muestra 1 y las de la muestra 5 no son directamente comparables en volumen: hay que compararlas en masa o mediante el ratio ME:DNA.</w:t>
       </w:r>
     </w:p>
     <w:p>
@@ -3254,7 +3693,7 @@
           <w:sz w:val="19"/>
           <w:szCs w:val="19"/>
         </w:rPr>
-        <w:t xml:space="preserve">Valores derivados de la tabla anterior dividiendo entre las 4 réplicas. La masa de ME se obtiene de la equivalencia que dan las propias notas (0,25 µl ≡ 9,25 µg, es decir, un stock de 37 µg/µl).</w:t>
+        <w:t xml:space="preserve">Valores derivados de la tabla anterior dividiendo entre las 4 réplicas. La masa de ME se obtiene de la equivalencia que dan las propias notas (0,25 µl ≡ 9,25 µg), que corresponde a la preparación de microemulsión a 37 µg/µl empleada en esta muestra.</w:t>
       </w:r>
     </w:p>
     <w:tbl>
@@ -8113,7 +8552,7 @@
                 <w:sz w:val="20"/>
                 <w:szCs w:val="20"/>
               </w:rPr>
-              <w:t xml:space="preserve">Punto a verificar: </w:t>
+              <w:t xml:space="preserve">Preparación distinta a la de la muestra 1: </w:t>
             </w:r>
             <w:r>
               <w:rPr>
@@ -8121,7 +8560,7 @@
                 <w:sz w:val="20"/>
                 <w:szCs w:val="20"/>
               </w:rPr>
-              <w:t xml:space="preserve">las cantidades de esta muestra implican un stock de ME de 10 µg/µl (1 µl por pocillo ≡ 10 µg), mientras que las de la muestra 1 implican 37 µg/µl (0,25 µl ≡ 9,25 µg). Si ambas muestras usan la misma preparación de ME, una de las dos equivalencias debe revisarse; si son preparaciones distintas, conviene indicarlo expresamente en el documento.</w:t>
+              <w:t xml:space="preserve">la microemulsión empleada aquí está a 10 µg/µl (1 µl por pocillo ≡ 10 µg), frente a los 37 µg/µl de la muestra 1. De ahí que 2 µl por pocillo supongan aquí 20 µg de ME, mientras que en la muestra 1 ese mismo volumen equivale a 74 µg. Las dos muestras solo son comparables en masa de ME o por el ratio ME:DNA.</w:t>
             </w:r>
           </w:p>
         </w:tc>
@@ -9446,7 +9885,7 @@
           <w:sz w:val="21"/>
           <w:szCs w:val="21"/>
         </w:rPr>
-        <w:t xml:space="preserve">No existe ninguna anotación correspondiente a la muestra 3</w:t>
+        <w:t xml:space="preserve">La muestra 3 no figura porque no llegó a utilizarse</w:t>
       </w:r>
       <w:r>
         <w:rPr>
@@ -9454,7 +9893,7 @@
           <w:sz w:val="21"/>
           <w:szCs w:val="21"/>
         </w:rPr>
-        <w:t xml:space="preserve">.</w:t>
+        <w:t xml:space="preserve">; la numeración salta de la 2 a la 4.</w:t>
       </w:r>
     </w:p>
     <w:p>
@@ -9507,7 +9946,7 @@
           <w:sz w:val="21"/>
           <w:szCs w:val="21"/>
         </w:rPr>
-        <w:t xml:space="preserve">Significado de «ME»</w:t>
+        <w:t xml:space="preserve">Preparación de ME de las muestras 2 y 4</w:t>
       </w:r>
       <w:r>
         <w:rPr>
@@ -9515,35 +9954,7 @@
           <w:sz w:val="21"/>
           <w:szCs w:val="21"/>
         </w:rPr>
-        <w:t xml:space="preserve">: la sigla no se desarrolla en ningún punto de las notas.</w:t>
-      </w:r>
-    </w:p>
-    <w:p>
-      <w:pPr>
-        <w:pStyle w:val="ListParagraph"/>
-        <w:numPr>
-          <w:ilvl w:val="0"/>
-          <w:numId w:val="2"/>
-        </w:numPr>
-        <w:spacing w:after="70" w:line="276"/>
-      </w:pPr>
-      <w:r>
-        <w:rPr>
-          <w:rFonts w:ascii="Calibri" w:cs="Calibri" w:eastAsia="Calibri" w:hAnsi="Calibri"/>
-          <w:b/>
-          <w:bCs/>
-          <w:sz w:val="21"/>
-          <w:szCs w:val="21"/>
-        </w:rPr>
-        <w:t xml:space="preserve">Concentración del stock de ME</w:t>
-      </w:r>
-      <w:r>
-        <w:rPr>
-          <w:rFonts w:ascii="Calibri" w:cs="Calibri" w:eastAsia="Calibri" w:hAnsi="Calibri"/>
-          <w:sz w:val="21"/>
-          <w:szCs w:val="21"/>
-        </w:rPr>
-        <w:t xml:space="preserve">: las muestras 1 y 5 implican concentraciones distintas (37 µg/µl frente a 10 µg/µl). Ver apartado 7.4.</w:t>
+        <w:t xml:space="preserve">: al haber dos preparaciones distintas, conviene indicar cuál se usó en cada una de estas dos muestras y a qué concentración.</w:t>
       </w:r>
     </w:p>
     <w:p>
@@ -9600,34 +10011,6 @@
           <w:szCs w:val="21"/>
         </w:rPr>
         <w:t xml:space="preserve">: no constan. Los 100 µl de medio por pocillo de la muestra 2 y los 10 µl de complejo añadidos sugieren placa de 96 pocillos, pero conviene confirmarlo.</w:t>
-      </w:r>
-    </w:p>
-    <w:p>
-      <w:pPr>
-        <w:pStyle w:val="ListParagraph"/>
-        <w:numPr>
-          <w:ilvl w:val="0"/>
-          <w:numId w:val="2"/>
-        </w:numPr>
-        <w:spacing w:after="70" w:line="276"/>
-      </w:pPr>
-      <w:r>
-        <w:rPr>
-          <w:rFonts w:ascii="Calibri" w:cs="Calibri" w:eastAsia="Calibri" w:hAnsi="Calibri"/>
-          <w:b/>
-          <w:bCs/>
-          <w:sz w:val="21"/>
-          <w:szCs w:val="21"/>
-        </w:rPr>
-        <w:t xml:space="preserve">Muestra 3</w:t>
-      </w:r>
-      <w:r>
-        <w:rPr>
-          <w:rFonts w:ascii="Calibri" w:cs="Calibri" w:eastAsia="Calibri" w:hAnsi="Calibri"/>
-          <w:sz w:val="21"/>
-          <w:szCs w:val="21"/>
-        </w:rPr>
-        <w:t xml:space="preserve">: no aparece en las notas. Indicar si no existe, si se descartó o si está documentada en otro sitio.</w:t>
       </w:r>
     </w:p>
     <w:p>

</xml_diff>